<commit_message>
updating Weekly progress log
</commit_message>
<xml_diff>
--- a/Weekly Progress Log.docx
+++ b/Weekly Progress Log.docx
@@ -194,17 +194,9 @@
         <w:rPr>
           <w:rFonts w:ascii="Aptos" w:hAnsi="Aptos"/>
         </w:rPr>
-        <w:t>baseline_</w:t>
-      </w:r>
-      <w:proofErr w:type="gramStart"/>
-      <w:r>
-        <w:rPr>
-          <w:rFonts w:ascii="Aptos" w:hAnsi="Aptos"/>
-        </w:rPr>
-        <w:t>results.json</w:t>
+        <w:t>baseline_results.json</w:t>
       </w:r>
       <w:proofErr w:type="spellEnd"/>
-      <w:proofErr w:type="gramEnd"/>
     </w:p>
     <w:p>
       <w:pPr>
@@ -221,17 +213,9 @@
         <w:rPr>
           <w:rFonts w:ascii="Aptos" w:hAnsi="Aptos"/>
         </w:rPr>
-        <w:t>profile_</w:t>
-      </w:r>
-      <w:proofErr w:type="gramStart"/>
-      <w:r>
-        <w:rPr>
-          <w:rFonts w:ascii="Aptos" w:hAnsi="Aptos"/>
-        </w:rPr>
-        <w:t>summary.json</w:t>
+        <w:t>profile_summary.json</w:t>
       </w:r>
       <w:proofErr w:type="spellEnd"/>
-      <w:proofErr w:type="gramEnd"/>
     </w:p>
     <w:p>
       <w:pPr>
@@ -310,7 +294,7 @@
           <w:rFonts w:ascii="Aptos" w:hAnsi="Aptos"/>
         </w:rPr>
         <w:pict w14:anchorId="0C3C67E3">
-          <v:rect id="_x0000_i1031" style="width:0;height:1.5pt" o:hrstd="t" o:hr="t" fillcolor="#a0a0a0" stroked="f"/>
+          <v:rect id="_x0000_i1025" style="width:0;height:1.5pt" o:hrstd="t" o:hr="t" fillcolor="#a0a0a0" stroked="f"/>
         </w:pict>
       </w:r>
     </w:p>
@@ -458,6 +442,55 @@
     </w:p>
     <w:p>
       <w:pPr>
+        <w:numPr>
+          <w:ilvl w:val="0"/>
+          <w:numId w:val="4"/>
+        </w:numPr>
+        <w:rPr>
+          <w:rFonts w:ascii="Aptos" w:hAnsi="Aptos"/>
+        </w:rPr>
+      </w:pPr>
+      <w:r>
+        <w:rPr>
+          <w:rFonts w:ascii="Aptos" w:hAnsi="Aptos"/>
+        </w:rPr>
+        <w:lastRenderedPageBreak/>
+        <w:t>Calibration analysis using brier and curve</w:t>
+      </w:r>
+    </w:p>
+    <w:p>
+      <w:pPr>
+        <w:numPr>
+          <w:ilvl w:val="0"/>
+          <w:numId w:val="4"/>
+        </w:numPr>
+        <w:rPr>
+          <w:rFonts w:ascii="Aptos" w:hAnsi="Aptos"/>
+        </w:rPr>
+      </w:pPr>
+      <w:r>
+        <w:rPr>
+          <w:rFonts w:ascii="Aptos" w:hAnsi="Aptos"/>
+        </w:rPr>
+        <w:t xml:space="preserve">Experiment adding </w:t>
+      </w:r>
+      <w:proofErr w:type="spellStart"/>
+      <w:r>
+        <w:rPr>
+          <w:rFonts w:ascii="Aptos" w:hAnsi="Aptos"/>
+        </w:rPr>
+        <w:t>credit_utilization</w:t>
+      </w:r>
+      <w:proofErr w:type="spellEnd"/>
+      <w:r>
+        <w:rPr>
+          <w:rFonts w:ascii="Aptos" w:hAnsi="Aptos"/>
+        </w:rPr>
+        <w:t xml:space="preserve"> feature</w:t>
+      </w:r>
+    </w:p>
+    <w:p>
+      <w:pPr>
         <w:rPr>
           <w:rFonts w:ascii="Aptos" w:hAnsi="Aptos"/>
         </w:rPr>
@@ -468,7 +501,6 @@
           <w:b/>
           <w:bCs/>
         </w:rPr>
-        <w:lastRenderedPageBreak/>
         <w:t>Deliverables</w:t>
       </w:r>
     </w:p>
@@ -487,17 +519,9 @@
         <w:rPr>
           <w:rFonts w:ascii="Aptos" w:hAnsi="Aptos"/>
         </w:rPr>
-        <w:t>threshold_</w:t>
-      </w:r>
-      <w:proofErr w:type="gramStart"/>
-      <w:r>
-        <w:rPr>
-          <w:rFonts w:ascii="Aptos" w:hAnsi="Aptos"/>
-        </w:rPr>
-        <w:t>analysis.json</w:t>
+        <w:t>threshold_analysis.json</w:t>
       </w:r>
       <w:proofErr w:type="spellEnd"/>
-      <w:proofErr w:type="gramEnd"/>
     </w:p>
     <w:p>
       <w:pPr>
@@ -535,6 +559,42 @@
     </w:p>
     <w:p>
       <w:pPr>
+        <w:numPr>
+          <w:ilvl w:val="0"/>
+          <w:numId w:val="5"/>
+        </w:numPr>
+        <w:rPr>
+          <w:rFonts w:ascii="Aptos" w:hAnsi="Aptos"/>
+        </w:rPr>
+      </w:pPr>
+      <w:proofErr w:type="spellStart"/>
+      <w:r>
+        <w:rPr>
+          <w:rFonts w:ascii="Aptos" w:hAnsi="Aptos"/>
+        </w:rPr>
+        <w:t>calibration_analysis.json</w:t>
+      </w:r>
+      <w:proofErr w:type="spellEnd"/>
+    </w:p>
+    <w:p>
+      <w:pPr>
+        <w:numPr>
+          <w:ilvl w:val="0"/>
+          <w:numId w:val="5"/>
+        </w:numPr>
+        <w:rPr>
+          <w:rFonts w:ascii="Aptos" w:hAnsi="Aptos"/>
+        </w:rPr>
+      </w:pPr>
+      <w:r>
+        <w:rPr>
+          <w:rFonts w:ascii="Aptos" w:hAnsi="Aptos"/>
+        </w:rPr>
+        <w:t>reports/credit_utilization_v1</w:t>
+      </w:r>
+    </w:p>
+    <w:p>
+      <w:pPr>
         <w:rPr>
           <w:rFonts w:ascii="Aptos" w:hAnsi="Aptos"/>
         </w:rPr>
@@ -597,6 +657,40 @@
           <w:rFonts w:ascii="Aptos" w:hAnsi="Aptos"/>
         </w:rPr>
         <w:t>Importance of evaluation under real-world constraints</w:t>
+      </w:r>
+    </w:p>
+    <w:p>
+      <w:pPr>
+        <w:numPr>
+          <w:ilvl w:val="0"/>
+          <w:numId w:val="6"/>
+        </w:numPr>
+        <w:rPr>
+          <w:rFonts w:ascii="Aptos" w:hAnsi="Aptos"/>
+        </w:rPr>
+      </w:pPr>
+      <w:r>
+        <w:rPr>
+          <w:rFonts w:ascii="Aptos" w:hAnsi="Aptos"/>
+        </w:rPr>
+        <w:t>Calibration and its impact in ROC-AUC, how to interpret secondary effects</w:t>
+      </w:r>
+    </w:p>
+    <w:p>
+      <w:pPr>
+        <w:numPr>
+          <w:ilvl w:val="0"/>
+          <w:numId w:val="6"/>
+        </w:numPr>
+        <w:rPr>
+          <w:rFonts w:ascii="Aptos" w:hAnsi="Aptos"/>
+        </w:rPr>
+      </w:pPr>
+      <w:r>
+        <w:rPr>
+          <w:rFonts w:ascii="Aptos" w:hAnsi="Aptos"/>
+        </w:rPr>
+        <w:t>New features don’t always give additional value to the model</w:t>
       </w:r>
     </w:p>
     <w:p>
@@ -2145,6 +2239,7 @@
   <w:style w:type="character" w:default="1" w:styleId="DefaultParagraphFont">
     <w:name w:val="Default Paragraph Font"/>
     <w:uiPriority w:val="1"/>
+    <w:semiHidden/>
     <w:unhideWhenUsed/>
   </w:style>
   <w:style w:type="table" w:default="1" w:styleId="TableNormal">

</xml_diff>

<commit_message>
utilization x PAY_0 feature and analysis, README update and Weekly Progress
</commit_message>
<xml_diff>
--- a/Weekly Progress Log.docx
+++ b/Weekly Progress Log.docx
@@ -194,9 +194,17 @@
         <w:rPr>
           <w:rFonts w:ascii="Aptos" w:hAnsi="Aptos"/>
         </w:rPr>
-        <w:t>baseline_results.json</w:t>
+        <w:t>baseline_</w:t>
+      </w:r>
+      <w:proofErr w:type="gramStart"/>
+      <w:r>
+        <w:rPr>
+          <w:rFonts w:ascii="Aptos" w:hAnsi="Aptos"/>
+        </w:rPr>
+        <w:t>results.json</w:t>
       </w:r>
       <w:proofErr w:type="spellEnd"/>
+      <w:proofErr w:type="gramEnd"/>
     </w:p>
     <w:p>
       <w:pPr>
@@ -213,9 +221,17 @@
         <w:rPr>
           <w:rFonts w:ascii="Aptos" w:hAnsi="Aptos"/>
         </w:rPr>
-        <w:t>profile_summary.json</w:t>
+        <w:t>profile_</w:t>
+      </w:r>
+      <w:proofErr w:type="gramStart"/>
+      <w:r>
+        <w:rPr>
+          <w:rFonts w:ascii="Aptos" w:hAnsi="Aptos"/>
+        </w:rPr>
+        <w:t>summary.json</w:t>
       </w:r>
       <w:proofErr w:type="spellEnd"/>
+      <w:proofErr w:type="gramEnd"/>
     </w:p>
     <w:p>
       <w:pPr>
@@ -289,10 +305,74 @@
           <w:rFonts w:ascii="Aptos" w:hAnsi="Aptos"/>
         </w:rPr>
       </w:pPr>
-      <w:r>
-        <w:rPr>
-          <w:rFonts w:ascii="Aptos" w:hAnsi="Aptos"/>
-        </w:rPr>
+    </w:p>
+    <w:p>
+      <w:pPr>
+        <w:rPr>
+          <w:rFonts w:ascii="Aptos" w:hAnsi="Aptos"/>
+        </w:rPr>
+      </w:pPr>
+    </w:p>
+    <w:p>
+      <w:pPr>
+        <w:rPr>
+          <w:rFonts w:ascii="Aptos" w:hAnsi="Aptos"/>
+        </w:rPr>
+      </w:pPr>
+    </w:p>
+    <w:p>
+      <w:pPr>
+        <w:rPr>
+          <w:rFonts w:ascii="Aptos" w:hAnsi="Aptos"/>
+        </w:rPr>
+      </w:pPr>
+    </w:p>
+    <w:p>
+      <w:pPr>
+        <w:rPr>
+          <w:rFonts w:ascii="Aptos" w:hAnsi="Aptos"/>
+        </w:rPr>
+      </w:pPr>
+    </w:p>
+    <w:p>
+      <w:pPr>
+        <w:rPr>
+          <w:rFonts w:ascii="Aptos" w:hAnsi="Aptos"/>
+        </w:rPr>
+      </w:pPr>
+    </w:p>
+    <w:p>
+      <w:pPr>
+        <w:rPr>
+          <w:rFonts w:ascii="Aptos" w:hAnsi="Aptos"/>
+        </w:rPr>
+      </w:pPr>
+    </w:p>
+    <w:p>
+      <w:pPr>
+        <w:rPr>
+          <w:rFonts w:ascii="Aptos" w:hAnsi="Aptos"/>
+        </w:rPr>
+      </w:pPr>
+    </w:p>
+    <w:p>
+      <w:pPr>
+        <w:rPr>
+          <w:rFonts w:ascii="Aptos" w:hAnsi="Aptos"/>
+        </w:rPr>
+      </w:pPr>
+    </w:p>
+    <w:p>
+      <w:pPr>
+        <w:rPr>
+          <w:rFonts w:ascii="Aptos" w:hAnsi="Aptos"/>
+        </w:rPr>
+      </w:pPr>
+      <w:r>
+        <w:rPr>
+          <w:rFonts w:ascii="Aptos" w:hAnsi="Aptos"/>
+        </w:rPr>
+        <w:lastRenderedPageBreak/>
         <w:pict w14:anchorId="0C3C67E3">
           <v:rect id="_x0000_i1025" style="width:0;height:1.5pt" o:hrstd="t" o:hr="t" fillcolor="#a0a0a0" stroked="f"/>
         </w:pict>
@@ -312,13 +392,15 @@
           <w:b/>
           <w:bCs/>
         </w:rPr>
-        <w:t>Week 2 – Operational Threshold Analysis &amp; Testing</w:t>
-      </w:r>
-    </w:p>
-    <w:p>
-      <w:pPr>
-        <w:rPr>
-          <w:rFonts w:ascii="Aptos" w:hAnsi="Aptos"/>
+        <w:t>Week 2 – Operational Evaluation &amp; Feature Engineering</w:t>
+      </w:r>
+    </w:p>
+    <w:p>
+      <w:pPr>
+        <w:rPr>
+          <w:rFonts w:ascii="Aptos" w:hAnsi="Aptos"/>
+          <w:b/>
+          <w:bCs/>
         </w:rPr>
       </w:pPr>
       <w:r>
@@ -334,363 +416,305 @@
       <w:pPr>
         <w:numPr>
           <w:ilvl w:val="0"/>
-          <w:numId w:val="4"/>
+          <w:numId w:val="7"/>
         </w:numPr>
         <w:rPr>
           <w:rFonts w:ascii="Aptos" w:hAnsi="Aptos"/>
-        </w:rPr>
-      </w:pPr>
-      <w:r>
-        <w:rPr>
-          <w:rFonts w:ascii="Aptos" w:hAnsi="Aptos"/>
-        </w:rPr>
-        <w:t>Out-of-fold probability generation</w:t>
+          <w:b/>
+          <w:bCs/>
+        </w:rPr>
+      </w:pPr>
+      <w:r>
+        <w:rPr>
+          <w:rFonts w:ascii="Aptos" w:hAnsi="Aptos"/>
+          <w:b/>
+          <w:bCs/>
+        </w:rPr>
+        <w:t>Implemented threshold-based policy evaluation</w:t>
       </w:r>
     </w:p>
     <w:p>
       <w:pPr>
         <w:numPr>
           <w:ilvl w:val="0"/>
-          <w:numId w:val="4"/>
+          <w:numId w:val="7"/>
         </w:numPr>
         <w:rPr>
           <w:rFonts w:ascii="Aptos" w:hAnsi="Aptos"/>
-        </w:rPr>
-      </w:pPr>
-      <w:r>
-        <w:rPr>
-          <w:rFonts w:ascii="Aptos" w:hAnsi="Aptos"/>
-        </w:rPr>
-        <w:t>Threshold search under recall and precision constraints</w:t>
+          <w:b/>
+          <w:bCs/>
+        </w:rPr>
+      </w:pPr>
+      <w:r>
+        <w:rPr>
+          <w:rFonts w:ascii="Aptos" w:hAnsi="Aptos"/>
+          <w:b/>
+          <w:bCs/>
+        </w:rPr>
+        <w:t>Compared models under Recall and Precision constraints</w:t>
       </w:r>
     </w:p>
     <w:p>
       <w:pPr>
         <w:numPr>
           <w:ilvl w:val="0"/>
-          <w:numId w:val="4"/>
+          <w:numId w:val="7"/>
         </w:numPr>
         <w:rPr>
           <w:rFonts w:ascii="Aptos" w:hAnsi="Aptos"/>
-        </w:rPr>
-      </w:pPr>
-      <w:r>
-        <w:rPr>
-          <w:rFonts w:ascii="Aptos" w:hAnsi="Aptos"/>
-        </w:rPr>
-        <w:t>Policy-based model evaluation</w:t>
+          <w:b/>
+          <w:bCs/>
+        </w:rPr>
+      </w:pPr>
+      <w:r>
+        <w:rPr>
+          <w:rFonts w:ascii="Aptos" w:hAnsi="Aptos"/>
+          <w:b/>
+          <w:bCs/>
+        </w:rPr>
+        <w:t>Added probability calibration analysis (Brier score + calibration curve)</w:t>
       </w:r>
     </w:p>
     <w:p>
       <w:pPr>
         <w:numPr>
           <w:ilvl w:val="0"/>
-          <w:numId w:val="4"/>
+          <w:numId w:val="7"/>
         </w:numPr>
         <w:rPr>
           <w:rFonts w:ascii="Aptos" w:hAnsi="Aptos"/>
-        </w:rPr>
-      </w:pPr>
-      <w:r>
-        <w:rPr>
-          <w:rFonts w:ascii="Aptos" w:hAnsi="Aptos"/>
-        </w:rPr>
-        <w:t>Operational impact quantification</w:t>
+          <w:b/>
+          <w:bCs/>
+        </w:rPr>
+      </w:pPr>
+      <w:r>
+        <w:rPr>
+          <w:rFonts w:ascii="Aptos" w:hAnsi="Aptos"/>
+          <w:b/>
+          <w:bCs/>
+        </w:rPr>
+        <w:t xml:space="preserve">Introduced </w:t>
+      </w:r>
+      <w:proofErr w:type="spellStart"/>
+      <w:r>
+        <w:rPr>
+          <w:rFonts w:ascii="Aptos" w:hAnsi="Aptos"/>
+          <w:b/>
+          <w:bCs/>
+        </w:rPr>
+        <w:t>credit_utilization</w:t>
+      </w:r>
+      <w:proofErr w:type="spellEnd"/>
+      <w:r>
+        <w:rPr>
+          <w:rFonts w:ascii="Aptos" w:hAnsi="Aptos"/>
+          <w:b/>
+          <w:bCs/>
+        </w:rPr>
+        <w:t xml:space="preserve"> feature</w:t>
       </w:r>
     </w:p>
     <w:p>
       <w:pPr>
         <w:numPr>
           <w:ilvl w:val="0"/>
-          <w:numId w:val="4"/>
+          <w:numId w:val="7"/>
         </w:numPr>
         <w:rPr>
           <w:rFonts w:ascii="Aptos" w:hAnsi="Aptos"/>
-        </w:rPr>
-      </w:pPr>
-      <w:proofErr w:type="spellStart"/>
-      <w:r>
-        <w:rPr>
-          <w:rFonts w:ascii="Aptos" w:hAnsi="Aptos"/>
-        </w:rPr>
-        <w:t>Pytest</w:t>
-      </w:r>
-      <w:proofErr w:type="spellEnd"/>
-      <w:r>
-        <w:rPr>
-          <w:rFonts w:ascii="Aptos" w:hAnsi="Aptos"/>
-        </w:rPr>
-        <w:t xml:space="preserve"> suite added (4 tests)</w:t>
+          <w:b/>
+          <w:bCs/>
+        </w:rPr>
+      </w:pPr>
+      <w:r>
+        <w:rPr>
+          <w:rFonts w:ascii="Aptos" w:hAnsi="Aptos"/>
+          <w:b/>
+          <w:bCs/>
+        </w:rPr>
+        <w:t>Designed and validated interaction feature: utilization × PAY_0</w:t>
       </w:r>
     </w:p>
     <w:p>
       <w:pPr>
         <w:numPr>
           <w:ilvl w:val="0"/>
-          <w:numId w:val="4"/>
+          <w:numId w:val="7"/>
         </w:numPr>
         <w:rPr>
           <w:rFonts w:ascii="Aptos" w:hAnsi="Aptos"/>
-        </w:rPr>
-      </w:pPr>
-      <w:r>
-        <w:rPr>
-          <w:rFonts w:ascii="Aptos" w:hAnsi="Aptos"/>
-        </w:rPr>
-        <w:t>README refactored for reproducibility</w:t>
+          <w:b/>
+          <w:bCs/>
+        </w:rPr>
+      </w:pPr>
+      <w:r>
+        <w:rPr>
+          <w:rFonts w:ascii="Aptos" w:hAnsi="Aptos"/>
+          <w:b/>
+          <w:bCs/>
+        </w:rPr>
+        <w:t>Improved Logistic ROC-AUC from 0.747 → 0.756</w:t>
       </w:r>
     </w:p>
     <w:p>
       <w:pPr>
         <w:numPr>
           <w:ilvl w:val="0"/>
-          <w:numId w:val="4"/>
+          <w:numId w:val="7"/>
         </w:numPr>
         <w:rPr>
           <w:rFonts w:ascii="Aptos" w:hAnsi="Aptos"/>
-        </w:rPr>
-      </w:pPr>
-      <w:r>
-        <w:rPr>
-          <w:rFonts w:ascii="Aptos" w:hAnsi="Aptos"/>
-        </w:rPr>
-        <w:lastRenderedPageBreak/>
-        <w:t>Calibration analysis using brier and curve</w:t>
+          <w:b/>
+          <w:bCs/>
+        </w:rPr>
+      </w:pPr>
+      <w:r>
+        <w:rPr>
+          <w:rFonts w:ascii="Aptos" w:hAnsi="Aptos"/>
+          <w:b/>
+          <w:bCs/>
+        </w:rPr>
+        <w:t xml:space="preserve">Added </w:t>
+      </w:r>
+      <w:proofErr w:type="spellStart"/>
+      <w:r>
+        <w:rPr>
+          <w:rFonts w:ascii="Aptos" w:hAnsi="Aptos"/>
+          <w:b/>
+          <w:bCs/>
+        </w:rPr>
+        <w:t>pytest</w:t>
+      </w:r>
+      <w:proofErr w:type="spellEnd"/>
+      <w:r>
+        <w:rPr>
+          <w:rFonts w:ascii="Aptos" w:hAnsi="Aptos"/>
+          <w:b/>
+          <w:bCs/>
+        </w:rPr>
+        <w:t xml:space="preserve"> suite for pipeline validation</w:t>
       </w:r>
     </w:p>
     <w:p>
       <w:pPr>
         <w:numPr>
           <w:ilvl w:val="0"/>
-          <w:numId w:val="4"/>
+          <w:numId w:val="7"/>
         </w:numPr>
         <w:rPr>
           <w:rFonts w:ascii="Aptos" w:hAnsi="Aptos"/>
-        </w:rPr>
-      </w:pPr>
-      <w:r>
-        <w:rPr>
-          <w:rFonts w:ascii="Aptos" w:hAnsi="Aptos"/>
-        </w:rPr>
-        <w:t xml:space="preserve">Experiment adding </w:t>
-      </w:r>
-      <w:proofErr w:type="spellStart"/>
-      <w:r>
-        <w:rPr>
-          <w:rFonts w:ascii="Aptos" w:hAnsi="Aptos"/>
-        </w:rPr>
-        <w:t>credit_utilization</w:t>
-      </w:r>
-      <w:proofErr w:type="spellEnd"/>
-      <w:r>
-        <w:rPr>
-          <w:rFonts w:ascii="Aptos" w:hAnsi="Aptos"/>
-        </w:rPr>
-        <w:t xml:space="preserve"> feature</w:t>
-      </w:r>
-    </w:p>
-    <w:p>
-      <w:pPr>
-        <w:rPr>
-          <w:rFonts w:ascii="Aptos" w:hAnsi="Aptos"/>
-        </w:rPr>
-      </w:pPr>
-      <w:r>
-        <w:rPr>
-          <w:rFonts w:ascii="Aptos" w:hAnsi="Aptos"/>
-          <w:b/>
-          <w:bCs/>
-        </w:rPr>
-        <w:t>Deliverables</w:t>
+          <w:b/>
+          <w:bCs/>
+        </w:rPr>
+      </w:pPr>
+      <w:r>
+        <w:rPr>
+          <w:rFonts w:ascii="Aptos" w:hAnsi="Aptos"/>
+          <w:b/>
+          <w:bCs/>
+        </w:rPr>
+        <w:t>Structured experiment tracking per folder</w:t>
+      </w:r>
+    </w:p>
+    <w:p>
+      <w:pPr>
+        <w:rPr>
+          <w:rFonts w:ascii="Aptos" w:hAnsi="Aptos"/>
+          <w:b/>
+          <w:bCs/>
+        </w:rPr>
+      </w:pPr>
+      <w:r>
+        <w:rPr>
+          <w:rFonts w:ascii="Aptos" w:hAnsi="Aptos"/>
+          <w:b/>
+          <w:bCs/>
+        </w:rPr>
+        <w:t>Key Learning</w:t>
       </w:r>
     </w:p>
     <w:p>
       <w:pPr>
         <w:numPr>
           <w:ilvl w:val="0"/>
-          <w:numId w:val="5"/>
+          <w:numId w:val="8"/>
         </w:numPr>
         <w:rPr>
           <w:rFonts w:ascii="Aptos" w:hAnsi="Aptos"/>
-        </w:rPr>
-      </w:pPr>
-      <w:proofErr w:type="spellStart"/>
-      <w:r>
-        <w:rPr>
-          <w:rFonts w:ascii="Aptos" w:hAnsi="Aptos"/>
-        </w:rPr>
-        <w:t>threshold_analysis.json</w:t>
-      </w:r>
-      <w:proofErr w:type="spellEnd"/>
+          <w:b/>
+          <w:bCs/>
+        </w:rPr>
+      </w:pPr>
+      <w:r>
+        <w:rPr>
+          <w:rFonts w:ascii="Aptos" w:hAnsi="Aptos"/>
+          <w:b/>
+          <w:bCs/>
+        </w:rPr>
+        <w:t>Ranking metrics vs operational constraints</w:t>
+      </w:r>
     </w:p>
     <w:p>
       <w:pPr>
         <w:numPr>
           <w:ilvl w:val="0"/>
-          <w:numId w:val="5"/>
+          <w:numId w:val="8"/>
         </w:numPr>
         <w:rPr>
           <w:rFonts w:ascii="Aptos" w:hAnsi="Aptos"/>
-        </w:rPr>
-      </w:pPr>
-      <w:r>
-        <w:rPr>
-          <w:rFonts w:ascii="Aptos" w:hAnsi="Aptos"/>
-        </w:rPr>
-        <w:t>model_comparison_v2.md</w:t>
+          <w:b/>
+          <w:bCs/>
+        </w:rPr>
+      </w:pPr>
+      <w:r>
+        <w:rPr>
+          <w:rFonts w:ascii="Aptos" w:hAnsi="Aptos"/>
+          <w:b/>
+          <w:bCs/>
+        </w:rPr>
+        <w:t>Calibration vs discrimination</w:t>
       </w:r>
     </w:p>
     <w:p>
       <w:pPr>
         <w:numPr>
           <w:ilvl w:val="0"/>
-          <w:numId w:val="5"/>
+          <w:numId w:val="8"/>
         </w:numPr>
         <w:rPr>
           <w:rFonts w:ascii="Aptos" w:hAnsi="Aptos"/>
-        </w:rPr>
-      </w:pPr>
-      <w:r>
-        <w:rPr>
-          <w:rFonts w:ascii="Aptos" w:hAnsi="Aptos"/>
-        </w:rPr>
-        <w:t>tests/ folder</w:t>
+          <w:b/>
+          <w:bCs/>
+        </w:rPr>
+      </w:pPr>
+      <w:r>
+        <w:rPr>
+          <w:rFonts w:ascii="Aptos" w:hAnsi="Aptos"/>
+          <w:b/>
+          <w:bCs/>
+        </w:rPr>
+        <w:t>When to prefer interpretability over raw performance</w:t>
       </w:r>
     </w:p>
     <w:p>
       <w:pPr>
         <w:numPr>
           <w:ilvl w:val="0"/>
-          <w:numId w:val="5"/>
+          <w:numId w:val="8"/>
         </w:numPr>
         <w:rPr>
           <w:rFonts w:ascii="Aptos" w:hAnsi="Aptos"/>
-        </w:rPr>
-      </w:pPr>
-      <w:proofErr w:type="spellStart"/>
-      <w:r>
-        <w:rPr>
-          <w:rFonts w:ascii="Aptos" w:hAnsi="Aptos"/>
-        </w:rPr>
-        <w:t>calibration_analysis.json</w:t>
-      </w:r>
-      <w:proofErr w:type="spellEnd"/>
-    </w:p>
-    <w:p>
-      <w:pPr>
-        <w:numPr>
-          <w:ilvl w:val="0"/>
-          <w:numId w:val="5"/>
-        </w:numPr>
-        <w:rPr>
-          <w:rFonts w:ascii="Aptos" w:hAnsi="Aptos"/>
-        </w:rPr>
-      </w:pPr>
-      <w:r>
-        <w:rPr>
-          <w:rFonts w:ascii="Aptos" w:hAnsi="Aptos"/>
-        </w:rPr>
-        <w:t>reports/credit_utilization_v1</w:t>
-      </w:r>
-    </w:p>
-    <w:p>
-      <w:pPr>
-        <w:rPr>
-          <w:rFonts w:ascii="Aptos" w:hAnsi="Aptos"/>
-        </w:rPr>
-      </w:pPr>
-      <w:r>
-        <w:rPr>
-          <w:rFonts w:ascii="Aptos" w:hAnsi="Aptos"/>
-          <w:b/>
-          <w:bCs/>
-        </w:rPr>
-        <w:t>Key Learning</w:t>
-      </w:r>
-    </w:p>
-    <w:p>
-      <w:pPr>
-        <w:numPr>
-          <w:ilvl w:val="0"/>
-          <w:numId w:val="6"/>
-        </w:numPr>
-        <w:rPr>
-          <w:rFonts w:ascii="Aptos" w:hAnsi="Aptos"/>
-        </w:rPr>
-      </w:pPr>
-      <w:r>
-        <w:rPr>
-          <w:rFonts w:ascii="Aptos" w:hAnsi="Aptos"/>
-        </w:rPr>
-        <w:t>Constraint-based decision policies</w:t>
-      </w:r>
-    </w:p>
-    <w:p>
-      <w:pPr>
-        <w:numPr>
-          <w:ilvl w:val="0"/>
-          <w:numId w:val="6"/>
-        </w:numPr>
-        <w:rPr>
-          <w:rFonts w:ascii="Aptos" w:hAnsi="Aptos"/>
-        </w:rPr>
-      </w:pPr>
-      <w:r>
-        <w:rPr>
-          <w:rFonts w:ascii="Aptos" w:hAnsi="Aptos"/>
-        </w:rPr>
-        <w:t>Trade-offs between precision, recall, and operational volume</w:t>
-      </w:r>
-    </w:p>
-    <w:p>
-      <w:pPr>
-        <w:numPr>
-          <w:ilvl w:val="0"/>
-          <w:numId w:val="6"/>
-        </w:numPr>
-        <w:rPr>
-          <w:rFonts w:ascii="Aptos" w:hAnsi="Aptos"/>
-        </w:rPr>
-      </w:pPr>
-      <w:r>
-        <w:rPr>
-          <w:rFonts w:ascii="Aptos" w:hAnsi="Aptos"/>
-        </w:rPr>
-        <w:t>Importance of evaluation under real-world constraints</w:t>
-      </w:r>
-    </w:p>
-    <w:p>
-      <w:pPr>
-        <w:numPr>
-          <w:ilvl w:val="0"/>
-          <w:numId w:val="6"/>
-        </w:numPr>
-        <w:rPr>
-          <w:rFonts w:ascii="Aptos" w:hAnsi="Aptos"/>
-        </w:rPr>
-      </w:pPr>
-      <w:r>
-        <w:rPr>
-          <w:rFonts w:ascii="Aptos" w:hAnsi="Aptos"/>
-        </w:rPr>
-        <w:t>Calibration and its impact in ROC-AUC, how to interpret secondary effects</w:t>
-      </w:r>
-    </w:p>
-    <w:p>
-      <w:pPr>
-        <w:numPr>
-          <w:ilvl w:val="0"/>
-          <w:numId w:val="6"/>
-        </w:numPr>
-        <w:rPr>
-          <w:rFonts w:ascii="Aptos" w:hAnsi="Aptos"/>
-        </w:rPr>
-      </w:pPr>
-      <w:r>
-        <w:rPr>
-          <w:rFonts w:ascii="Aptos" w:hAnsi="Aptos"/>
-        </w:rPr>
-        <w:t>New features don’t always give additional value to the model</w:t>
+          <w:b/>
+          <w:bCs/>
+        </w:rPr>
+      </w:pPr>
+      <w:r>
+        <w:rPr>
+          <w:rFonts w:ascii="Aptos" w:hAnsi="Aptos"/>
+          <w:b/>
+          <w:bCs/>
+        </w:rPr>
+        <w:t>Importance of explicit interaction terms in linear models</w:t>
       </w:r>
     </w:p>
     <w:p>
@@ -722,6 +746,155 @@
 <file path=word/numbering.xml><?xml version="1.0" encoding="utf-8"?>
 <w:numbering xmlns:wpc="http://schemas.microsoft.com/office/word/2010/wordprocessingCanvas" xmlns:cx="http://schemas.microsoft.com/office/drawing/2014/chartex" xmlns:cx1="http://schemas.microsoft.com/office/drawing/2015/9/8/chartex" xmlns:cx2="http://schemas.microsoft.com/office/drawing/2015/10/21/chartex" xmlns:cx3="http://schemas.microsoft.com/office/drawing/2016/5/9/chartex" xmlns:cx4="http://schemas.microsoft.com/office/drawing/2016/5/10/chartex" xmlns:cx5="http://schemas.microsoft.com/office/drawing/2016/5/11/chartex" xmlns:cx6="http://schemas.microsoft.com/office/drawing/2016/5/12/chartex" xmlns:cx7="http://schemas.microsoft.com/office/drawing/2016/5/13/chartex" xmlns:cx8="http://schemas.microsoft.com/office/drawing/2016/5/14/chartex" xmlns:mc="http://schemas.openxmlformats.org/markup-compatibility/2006" xmlns:aink="http://schemas.microsoft.com/office/drawing/2016/ink" xmlns:am3d="http://schemas.microsoft.com/office/drawing/2017/model3d" xmlns:o="urn:schemas-microsoft-com:office:office" xmlns:oel="http://schemas.microsoft.com/office/2019/extlst" xmlns:r="http://schemas.openxmlformats.org/officeDocument/2006/relationships" xmlns:m="http://schemas.openxmlformats.org/officeDocument/2006/math" xmlns:v="urn:schemas-microsoft-com:vml" xmlns:wp14="http://schemas.microsoft.com/office/word/2010/wordprocessingDrawing" xmlns:wp="http://schemas.openxmlformats.org/drawingml/2006/wordprocessingDrawing" xmlns:w10="urn:schemas-microsoft-com:office:word" xmlns:w="http://schemas.openxmlformats.org/wordprocessingml/2006/main" xmlns:w14="http://schemas.microsoft.com/office/word/2010/wordml" xmlns:w15="http://schemas.microsoft.com/office/word/2012/wordml" xmlns:w16cex="http://schemas.microsoft.com/office/word/2018/wordml/cex" xmlns:w16cid="http://schemas.microsoft.com/office/word/2016/wordml/cid" xmlns:w16="http://schemas.microsoft.com/office/word/2018/wordml" xmlns:w16du="http://schemas.microsoft.com/office/word/2023/wordml/word16du" xmlns:w16sdtdh="http://schemas.microsoft.com/office/word/2020/wordml/sdtdatahash" xmlns:w16sdtfl="http://schemas.microsoft.com/office/word/2024/wordml/sdtformatlock" xmlns:w16se="http://schemas.microsoft.com/office/word/2015/wordml/symex" xmlns:wpg="http://schemas.microsoft.com/office/word/2010/wordprocessingGroup" xmlns:wpi="http://schemas.microsoft.com/office/word/2010/wordprocessingInk" xmlns:wne="http://schemas.microsoft.com/office/word/2006/wordml" xmlns:wps="http://schemas.microsoft.com/office/word/2010/wordprocessingShape" mc:Ignorable="w14 w15 w16se w16cid w16 w16cex w16sdtdh w16sdtfl w16du wp14">
   <w:abstractNum w:abstractNumId="0" w15:restartNumberingAfterBreak="0">
+    <w:nsid w:val="13B70FC0"/>
+    <w:multiLevelType w:val="multilevel"/>
+    <w:tmpl w:val="EF202C28"/>
+    <w:lvl w:ilvl="0">
+      <w:start w:val="1"/>
+      <w:numFmt w:val="bullet"/>
+      <w:lvlText w:val=""/>
+      <w:lvlJc w:val="left"/>
+      <w:pPr>
+        <w:tabs>
+          <w:tab w:val="num" w:pos="720"/>
+        </w:tabs>
+        <w:ind w:left="720" w:hanging="360"/>
+      </w:pPr>
+      <w:rPr>
+        <w:rFonts w:ascii="Symbol" w:hAnsi="Symbol" w:hint="default"/>
+        <w:sz w:val="20"/>
+      </w:rPr>
+    </w:lvl>
+    <w:lvl w:ilvl="1" w:tentative="1">
+      <w:start w:val="1"/>
+      <w:numFmt w:val="bullet"/>
+      <w:lvlText w:val="o"/>
+      <w:lvlJc w:val="left"/>
+      <w:pPr>
+        <w:tabs>
+          <w:tab w:val="num" w:pos="1440"/>
+        </w:tabs>
+        <w:ind w:left="1440" w:hanging="360"/>
+      </w:pPr>
+      <w:rPr>
+        <w:rFonts w:ascii="Courier New" w:hAnsi="Courier New" w:hint="default"/>
+        <w:sz w:val="20"/>
+      </w:rPr>
+    </w:lvl>
+    <w:lvl w:ilvl="2" w:tentative="1">
+      <w:start w:val="1"/>
+      <w:numFmt w:val="bullet"/>
+      <w:lvlText w:val=""/>
+      <w:lvlJc w:val="left"/>
+      <w:pPr>
+        <w:tabs>
+          <w:tab w:val="num" w:pos="2160"/>
+        </w:tabs>
+        <w:ind w:left="2160" w:hanging="360"/>
+      </w:pPr>
+      <w:rPr>
+        <w:rFonts w:ascii="Wingdings" w:hAnsi="Wingdings" w:hint="default"/>
+        <w:sz w:val="20"/>
+      </w:rPr>
+    </w:lvl>
+    <w:lvl w:ilvl="3" w:tentative="1">
+      <w:start w:val="1"/>
+      <w:numFmt w:val="bullet"/>
+      <w:lvlText w:val=""/>
+      <w:lvlJc w:val="left"/>
+      <w:pPr>
+        <w:tabs>
+          <w:tab w:val="num" w:pos="2880"/>
+        </w:tabs>
+        <w:ind w:left="2880" w:hanging="360"/>
+      </w:pPr>
+      <w:rPr>
+        <w:rFonts w:ascii="Wingdings" w:hAnsi="Wingdings" w:hint="default"/>
+        <w:sz w:val="20"/>
+      </w:rPr>
+    </w:lvl>
+    <w:lvl w:ilvl="4" w:tentative="1">
+      <w:start w:val="1"/>
+      <w:numFmt w:val="bullet"/>
+      <w:lvlText w:val=""/>
+      <w:lvlJc w:val="left"/>
+      <w:pPr>
+        <w:tabs>
+          <w:tab w:val="num" w:pos="3600"/>
+        </w:tabs>
+        <w:ind w:left="3600" w:hanging="360"/>
+      </w:pPr>
+      <w:rPr>
+        <w:rFonts w:ascii="Wingdings" w:hAnsi="Wingdings" w:hint="default"/>
+        <w:sz w:val="20"/>
+      </w:rPr>
+    </w:lvl>
+    <w:lvl w:ilvl="5" w:tentative="1">
+      <w:start w:val="1"/>
+      <w:numFmt w:val="bullet"/>
+      <w:lvlText w:val=""/>
+      <w:lvlJc w:val="left"/>
+      <w:pPr>
+        <w:tabs>
+          <w:tab w:val="num" w:pos="4320"/>
+        </w:tabs>
+        <w:ind w:left="4320" w:hanging="360"/>
+      </w:pPr>
+      <w:rPr>
+        <w:rFonts w:ascii="Wingdings" w:hAnsi="Wingdings" w:hint="default"/>
+        <w:sz w:val="20"/>
+      </w:rPr>
+    </w:lvl>
+    <w:lvl w:ilvl="6" w:tentative="1">
+      <w:start w:val="1"/>
+      <w:numFmt w:val="bullet"/>
+      <w:lvlText w:val=""/>
+      <w:lvlJc w:val="left"/>
+      <w:pPr>
+        <w:tabs>
+          <w:tab w:val="num" w:pos="5040"/>
+        </w:tabs>
+        <w:ind w:left="5040" w:hanging="360"/>
+      </w:pPr>
+      <w:rPr>
+        <w:rFonts w:ascii="Wingdings" w:hAnsi="Wingdings" w:hint="default"/>
+        <w:sz w:val="20"/>
+      </w:rPr>
+    </w:lvl>
+    <w:lvl w:ilvl="7" w:tentative="1">
+      <w:start w:val="1"/>
+      <w:numFmt w:val="bullet"/>
+      <w:lvlText w:val=""/>
+      <w:lvlJc w:val="left"/>
+      <w:pPr>
+        <w:tabs>
+          <w:tab w:val="num" w:pos="5760"/>
+        </w:tabs>
+        <w:ind w:left="5760" w:hanging="360"/>
+      </w:pPr>
+      <w:rPr>
+        <w:rFonts w:ascii="Wingdings" w:hAnsi="Wingdings" w:hint="default"/>
+        <w:sz w:val="20"/>
+      </w:rPr>
+    </w:lvl>
+    <w:lvl w:ilvl="8" w:tentative="1">
+      <w:start w:val="1"/>
+      <w:numFmt w:val="bullet"/>
+      <w:lvlText w:val=""/>
+      <w:lvlJc w:val="left"/>
+      <w:pPr>
+        <w:tabs>
+          <w:tab w:val="num" w:pos="6480"/>
+        </w:tabs>
+        <w:ind w:left="6480" w:hanging="360"/>
+      </w:pPr>
+      <w:rPr>
+        <w:rFonts w:ascii="Wingdings" w:hAnsi="Wingdings" w:hint="default"/>
+        <w:sz w:val="20"/>
+      </w:rPr>
+    </w:lvl>
+  </w:abstractNum>
+  <w:abstractNum w:abstractNumId="1" w15:restartNumberingAfterBreak="0">
     <w:nsid w:val="2CE2124B"/>
     <w:multiLevelType w:val="multilevel"/>
     <w:tmpl w:val="DA429E92"/>
@@ -870,7 +1043,7 @@
       </w:rPr>
     </w:lvl>
   </w:abstractNum>
-  <w:abstractNum w:abstractNumId="1" w15:restartNumberingAfterBreak="0">
+  <w:abstractNum w:abstractNumId="2" w15:restartNumberingAfterBreak="0">
     <w:nsid w:val="3C92767C"/>
     <w:multiLevelType w:val="multilevel"/>
     <w:tmpl w:val="A2725AF0"/>
@@ -1019,7 +1192,7 @@
       </w:rPr>
     </w:lvl>
   </w:abstractNum>
-  <w:abstractNum w:abstractNumId="2" w15:restartNumberingAfterBreak="0">
+  <w:abstractNum w:abstractNumId="3" w15:restartNumberingAfterBreak="0">
     <w:nsid w:val="40FF3E5E"/>
     <w:multiLevelType w:val="multilevel"/>
     <w:tmpl w:val="9FCAB6B8"/>
@@ -1168,7 +1341,7 @@
       </w:rPr>
     </w:lvl>
   </w:abstractNum>
-  <w:abstractNum w:abstractNumId="3" w15:restartNumberingAfterBreak="0">
+  <w:abstractNum w:abstractNumId="4" w15:restartNumberingAfterBreak="0">
     <w:nsid w:val="4675384D"/>
     <w:multiLevelType w:val="multilevel"/>
     <w:tmpl w:val="4A40086C"/>
@@ -1317,7 +1490,7 @@
       </w:rPr>
     </w:lvl>
   </w:abstractNum>
-  <w:abstractNum w:abstractNumId="4" w15:restartNumberingAfterBreak="0">
+  <w:abstractNum w:abstractNumId="5" w15:restartNumberingAfterBreak="0">
     <w:nsid w:val="5CA14A1A"/>
     <w:multiLevelType w:val="multilevel"/>
     <w:tmpl w:val="16867C58"/>
@@ -1466,7 +1639,7 @@
       </w:rPr>
     </w:lvl>
   </w:abstractNum>
-  <w:abstractNum w:abstractNumId="5" w15:restartNumberingAfterBreak="0">
+  <w:abstractNum w:abstractNumId="6" w15:restartNumberingAfterBreak="0">
     <w:nsid w:val="639C1D96"/>
     <w:multiLevelType w:val="multilevel"/>
     <w:tmpl w:val="82E63036"/>
@@ -1615,23 +1788,178 @@
       </w:rPr>
     </w:lvl>
   </w:abstractNum>
+  <w:abstractNum w:abstractNumId="7" w15:restartNumberingAfterBreak="0">
+    <w:nsid w:val="656A63D7"/>
+    <w:multiLevelType w:val="multilevel"/>
+    <w:tmpl w:val="D89EA838"/>
+    <w:lvl w:ilvl="0">
+      <w:start w:val="1"/>
+      <w:numFmt w:val="bullet"/>
+      <w:lvlText w:val=""/>
+      <w:lvlJc w:val="left"/>
+      <w:pPr>
+        <w:tabs>
+          <w:tab w:val="num" w:pos="720"/>
+        </w:tabs>
+        <w:ind w:left="720" w:hanging="360"/>
+      </w:pPr>
+      <w:rPr>
+        <w:rFonts w:ascii="Symbol" w:hAnsi="Symbol" w:hint="default"/>
+        <w:sz w:val="20"/>
+      </w:rPr>
+    </w:lvl>
+    <w:lvl w:ilvl="1" w:tentative="1">
+      <w:start w:val="1"/>
+      <w:numFmt w:val="bullet"/>
+      <w:lvlText w:val="o"/>
+      <w:lvlJc w:val="left"/>
+      <w:pPr>
+        <w:tabs>
+          <w:tab w:val="num" w:pos="1440"/>
+        </w:tabs>
+        <w:ind w:left="1440" w:hanging="360"/>
+      </w:pPr>
+      <w:rPr>
+        <w:rFonts w:ascii="Courier New" w:hAnsi="Courier New" w:hint="default"/>
+        <w:sz w:val="20"/>
+      </w:rPr>
+    </w:lvl>
+    <w:lvl w:ilvl="2" w:tentative="1">
+      <w:start w:val="1"/>
+      <w:numFmt w:val="bullet"/>
+      <w:lvlText w:val=""/>
+      <w:lvlJc w:val="left"/>
+      <w:pPr>
+        <w:tabs>
+          <w:tab w:val="num" w:pos="2160"/>
+        </w:tabs>
+        <w:ind w:left="2160" w:hanging="360"/>
+      </w:pPr>
+      <w:rPr>
+        <w:rFonts w:ascii="Wingdings" w:hAnsi="Wingdings" w:hint="default"/>
+        <w:sz w:val="20"/>
+      </w:rPr>
+    </w:lvl>
+    <w:lvl w:ilvl="3" w:tentative="1">
+      <w:start w:val="1"/>
+      <w:numFmt w:val="bullet"/>
+      <w:lvlText w:val=""/>
+      <w:lvlJc w:val="left"/>
+      <w:pPr>
+        <w:tabs>
+          <w:tab w:val="num" w:pos="2880"/>
+        </w:tabs>
+        <w:ind w:left="2880" w:hanging="360"/>
+      </w:pPr>
+      <w:rPr>
+        <w:rFonts w:ascii="Wingdings" w:hAnsi="Wingdings" w:hint="default"/>
+        <w:sz w:val="20"/>
+      </w:rPr>
+    </w:lvl>
+    <w:lvl w:ilvl="4" w:tentative="1">
+      <w:start w:val="1"/>
+      <w:numFmt w:val="bullet"/>
+      <w:lvlText w:val=""/>
+      <w:lvlJc w:val="left"/>
+      <w:pPr>
+        <w:tabs>
+          <w:tab w:val="num" w:pos="3600"/>
+        </w:tabs>
+        <w:ind w:left="3600" w:hanging="360"/>
+      </w:pPr>
+      <w:rPr>
+        <w:rFonts w:ascii="Wingdings" w:hAnsi="Wingdings" w:hint="default"/>
+        <w:sz w:val="20"/>
+      </w:rPr>
+    </w:lvl>
+    <w:lvl w:ilvl="5" w:tentative="1">
+      <w:start w:val="1"/>
+      <w:numFmt w:val="bullet"/>
+      <w:lvlText w:val=""/>
+      <w:lvlJc w:val="left"/>
+      <w:pPr>
+        <w:tabs>
+          <w:tab w:val="num" w:pos="4320"/>
+        </w:tabs>
+        <w:ind w:left="4320" w:hanging="360"/>
+      </w:pPr>
+      <w:rPr>
+        <w:rFonts w:ascii="Wingdings" w:hAnsi="Wingdings" w:hint="default"/>
+        <w:sz w:val="20"/>
+      </w:rPr>
+    </w:lvl>
+    <w:lvl w:ilvl="6" w:tentative="1">
+      <w:start w:val="1"/>
+      <w:numFmt w:val="bullet"/>
+      <w:lvlText w:val=""/>
+      <w:lvlJc w:val="left"/>
+      <w:pPr>
+        <w:tabs>
+          <w:tab w:val="num" w:pos="5040"/>
+        </w:tabs>
+        <w:ind w:left="5040" w:hanging="360"/>
+      </w:pPr>
+      <w:rPr>
+        <w:rFonts w:ascii="Wingdings" w:hAnsi="Wingdings" w:hint="default"/>
+        <w:sz w:val="20"/>
+      </w:rPr>
+    </w:lvl>
+    <w:lvl w:ilvl="7" w:tentative="1">
+      <w:start w:val="1"/>
+      <w:numFmt w:val="bullet"/>
+      <w:lvlText w:val=""/>
+      <w:lvlJc w:val="left"/>
+      <w:pPr>
+        <w:tabs>
+          <w:tab w:val="num" w:pos="5760"/>
+        </w:tabs>
+        <w:ind w:left="5760" w:hanging="360"/>
+      </w:pPr>
+      <w:rPr>
+        <w:rFonts w:ascii="Wingdings" w:hAnsi="Wingdings" w:hint="default"/>
+        <w:sz w:val="20"/>
+      </w:rPr>
+    </w:lvl>
+    <w:lvl w:ilvl="8" w:tentative="1">
+      <w:start w:val="1"/>
+      <w:numFmt w:val="bullet"/>
+      <w:lvlText w:val=""/>
+      <w:lvlJc w:val="left"/>
+      <w:pPr>
+        <w:tabs>
+          <w:tab w:val="num" w:pos="6480"/>
+        </w:tabs>
+        <w:ind w:left="6480" w:hanging="360"/>
+      </w:pPr>
+      <w:rPr>
+        <w:rFonts w:ascii="Wingdings" w:hAnsi="Wingdings" w:hint="default"/>
+        <w:sz w:val="20"/>
+      </w:rPr>
+    </w:lvl>
+  </w:abstractNum>
   <w:num w:numId="1" w16cid:durableId="1658803763">
+    <w:abstractNumId w:val="5"/>
+  </w:num>
+  <w:num w:numId="2" w16cid:durableId="550963201">
+    <w:abstractNumId w:val="2"/>
+  </w:num>
+  <w:num w:numId="3" w16cid:durableId="298656822">
+    <w:abstractNumId w:val="3"/>
+  </w:num>
+  <w:num w:numId="4" w16cid:durableId="1824084054">
+    <w:abstractNumId w:val="6"/>
+  </w:num>
+  <w:num w:numId="5" w16cid:durableId="2061399162">
+    <w:abstractNumId w:val="1"/>
+  </w:num>
+  <w:num w:numId="6" w16cid:durableId="1077509714">
     <w:abstractNumId w:val="4"/>
   </w:num>
-  <w:num w:numId="2" w16cid:durableId="550963201">
-    <w:abstractNumId w:val="1"/>
+  <w:num w:numId="7" w16cid:durableId="267353169">
+    <w:abstractNumId w:val="7"/>
   </w:num>
-  <w:num w:numId="3" w16cid:durableId="298656822">
-    <w:abstractNumId w:val="2"/>
-  </w:num>
-  <w:num w:numId="4" w16cid:durableId="1824084054">
-    <w:abstractNumId w:val="5"/>
-  </w:num>
-  <w:num w:numId="5" w16cid:durableId="2061399162">
+  <w:num w:numId="8" w16cid:durableId="912399931">
     <w:abstractNumId w:val="0"/>
-  </w:num>
-  <w:num w:numId="6" w16cid:durableId="1077509714">
-    <w:abstractNumId w:val="3"/>
   </w:num>
 </w:numbering>
 </file>
@@ -2239,7 +2567,6 @@
   <w:style w:type="character" w:default="1" w:styleId="DefaultParagraphFont">
     <w:name w:val="Default Paragraph Font"/>
     <w:uiPriority w:val="1"/>
-    <w:semiHidden/>
     <w:unhideWhenUsed/>
   </w:style>
   <w:style w:type="table" w:default="1" w:styleId="TableNormal">

</xml_diff>